<commit_message>
Add model scenario comparison
</commit_message>
<xml_diff>
--- a/docs/final/Пояснювальна_записка_чернетка.docx
+++ b/docs/final/Пояснювальна_записка_чернетка.docx
@@ -2127,6 +2127,60 @@
           <w:sz w:val="24"/>
           <w:szCs w:val="24"/>
         </w:rPr>
+        <w:t xml:space="preserve">Емпіричні дослідження call-center arrivals також показують, що просте припущення про незалежний Poisson process не завжди достатнє. Brown et al. аналізують реальний телефонний контакт-центр з позиції queueing science і показують важливість arrival process, waiting time, service time, abandonment і time-varying behavior для операційного моделювання [17]. Ibrahim and L'Ecuyer порівнюють fixed-effects, mixed-effects і bivariate models для call center arrivals, що підсилює ідею: модель має враховувати як intraday pattern, так і залежності між днями або типами звернень [18].</w:t>
+      </w:r>
+    </w:p>
+    <w:p>
+      <w:pPr>
+        <w:spacing w:line="360" w:lineRule="auto" w:after="120"/>
+      </w:pPr>
+      <w:r>
+        <w:rPr>
+          <w:rFonts w:ascii="Times New Roman" w:hAnsi="Times New Roman" w:cs="Times New Roman"/>
+          <w:sz w:val="24"/>
+          <w:szCs w:val="24"/>
+        </w:rPr>
+        <w:t xml:space="preserve"/>
+      </w:r>
+    </w:p>
+    <w:p>
+      <w:pPr>
+        <w:ind w:firstLine="709"/>
+        <w:spacing w:line="360" w:lineRule="auto" w:after="120"/>
+      </w:pPr>
+      <w:r>
+        <w:rPr>
+          <w:rFonts w:ascii="Times New Roman" w:hAnsi="Times New Roman" w:cs="Times New Roman"/>
+          <w:sz w:val="24"/>
+          <w:szCs w:val="24"/>
+        </w:rPr>
+        <w:t xml:space="preserve">Окремий напрям літератури порівнює статистичні та machine learning approaches. Boulin у MIT thesis показує практичну цінність комбінації statistical forecasting і judgmental adjustments у sales call center context [19]. Manno et al. порівнюють deep and shallow neural networks для call center arrivals і роблять важливий для цього проєкту висновок: складніші neural approaches не завжди є автоматично кращими, а простіші моделі з продуманими features можуть бути конкурентними [20]. Тому в поточному проєкті акцент зроблено на explainable feature-based comparison, а не на демонстративно складній LSTM/Deep Learning моделі без operational benefit.</w:t>
+      </w:r>
+    </w:p>
+    <w:p>
+      <w:pPr>
+        <w:spacing w:line="360" w:lineRule="auto" w:after="120"/>
+      </w:pPr>
+      <w:r>
+        <w:rPr>
+          <w:rFonts w:ascii="Times New Roman" w:hAnsi="Times New Roman" w:cs="Times New Roman"/>
+          <w:sz w:val="24"/>
+          <w:szCs w:val="24"/>
+        </w:rPr>
+        <w:t xml:space="preserve"/>
+      </w:r>
+    </w:p>
+    <w:p>
+      <w:pPr>
+        <w:ind w:firstLine="709"/>
+        <w:spacing w:line="360" w:lineRule="auto" w:after="120"/>
+      </w:pPr>
+      <w:r>
+        <w:rPr>
+          <w:rFonts w:ascii="Times New Roman" w:hAnsi="Times New Roman" w:cs="Times New Roman"/>
+          <w:sz w:val="24"/>
+          <w:szCs w:val="24"/>
+        </w:rPr>
         <w:t xml:space="preserve">У літературі та практиці contact center planning часто використовуються:</w:t>
       </w:r>
     </w:p>
@@ -2319,7 +2373,61 @@
           <w:sz w:val="24"/>
           <w:szCs w:val="24"/>
         </w:rPr>
-        <w:t xml:space="preserve">Scheduling є окремою задачею operations research. Якщо forecasting відповідає на питання "скільки звернень очікується", а staffing - "скільки операторів потрібно", scheduling відповідає на питання "які конкретні люди в які зміни мають працювати". У практичних WFM-системах scheduling повинен враховувати shift templates, breaks, weekly limits, rest rules, availability, time off, skills і business hours. У поточній реалізації використано OR-Tools CP-SAT, тому constraints та objective function залишаються прозорими для пояснення у дипломній роботі.</w:t>
+        <w:t xml:space="preserve">Robbins and Medeiros порівнюють Erlang C з simulation model, де частину класичних припущень Erlang C послаблено, і показують, що у реальних contact centers така модель може не завжди точно відтворювати performance [21]. Це не означає, що Erlang C не можна використовувати; це означає, що в дипломній роботі його потрібно чесно описати як baseline queueing-theory staffing method і винести Erlang A / discrete-event simulation у future work.</w:t>
+      </w:r>
+    </w:p>
+    <w:p>
+      <w:pPr>
+        <w:spacing w:line="360" w:lineRule="auto" w:after="120"/>
+      </w:pPr>
+      <w:r>
+        <w:rPr>
+          <w:rFonts w:ascii="Times New Roman" w:hAnsi="Times New Roman" w:cs="Times New Roman"/>
+          <w:sz w:val="24"/>
+          <w:szCs w:val="24"/>
+        </w:rPr>
+        <w:t xml:space="preserve"/>
+      </w:r>
+    </w:p>
+    <w:p>
+      <w:pPr>
+        <w:ind w:firstLine="709"/>
+        <w:spacing w:line="360" w:lineRule="auto" w:after="120"/>
+      </w:pPr>
+      <w:r>
+        <w:rPr>
+          <w:rFonts w:ascii="Times New Roman" w:hAnsi="Times New Roman" w:cs="Times New Roman"/>
+          <w:sz w:val="24"/>
+          <w:szCs w:val="24"/>
+        </w:rPr>
+        <w:t xml:space="preserve">Scheduling є окремою задачею operations research. Якщо forecasting відповідає на питання "скільки звернень очікується", а staffing - "скільки операторів потрібно", scheduling відповідає на питання "які конкретні люди в які зміни мають працювати". У практичних WFM-системах scheduling повинен враховувати shift templates, breaks, weekly limits, rest rules, availability, time off, skills і business hours. Koole and Li описують стандартну decomposition logic: спочатку визначають required staffing levels, потім підбирають shifts, після цього shifts assigned to agents, і далі плануються activities during scheduled work time [2]. Це прямо відповідає pipeline цього проєкту.</w:t>
+      </w:r>
+    </w:p>
+    <w:p>
+      <w:pPr>
+        <w:spacing w:line="360" w:lineRule="auto" w:after="120"/>
+      </w:pPr>
+      <w:r>
+        <w:rPr>
+          <w:rFonts w:ascii="Times New Roman" w:hAnsi="Times New Roman" w:cs="Times New Roman"/>
+          <w:sz w:val="24"/>
+          <w:szCs w:val="24"/>
+        </w:rPr>
+        <w:t xml:space="preserve"/>
+      </w:r>
+    </w:p>
+    <w:p>
+      <w:pPr>
+        <w:ind w:firstLine="709"/>
+        <w:spacing w:line="360" w:lineRule="auto" w:after="120"/>
+      </w:pPr>
+      <w:r>
+        <w:rPr>
+          <w:rFonts w:ascii="Times New Roman" w:hAnsi="Times New Roman" w:cs="Times New Roman"/>
+          <w:sz w:val="24"/>
+          <w:szCs w:val="24"/>
+        </w:rPr>
+        <w:t xml:space="preserve">У більш складних contact centers scheduling переходить у multi-skill / multilingual optimization. Прикладом є ILP-модель scheduling of agents in inbound multilingual call centers, де враховуються segmentation by skills та labor law restrictions [22]. Поточна реалізація ще не має повного multi-skill routing, але обрана OR-Tools CP-SAT архітектура створює основу для такого розширення.</w:t>
       </w:r>
     </w:p>
     <w:p>
@@ -2484,6 +2592,60 @@
           <w:szCs w:val="24"/>
         </w:rPr>
         <w:t xml:space="preserve">Ринок contact center WFM є зрілим: великі платформи вже мають forecasting, scheduling, adherence і agent self-service. Це означає, що новизна навчального продукту не полягає в тому, що він першим автоматизує WFM. Його новизна полягає в прозорому, відтворюваному, explainable workflow, який демонструє весь шлях від public data до staffing decision.</w:t>
+      </w:r>
+    </w:p>
+    <w:p>
+      <w:pPr>
+        <w:spacing w:line="360" w:lineRule="auto" w:after="120"/>
+      </w:pPr>
+      <w:r>
+        <w:rPr>
+          <w:rFonts w:ascii="Times New Roman" w:hAnsi="Times New Roman" w:cs="Times New Roman"/>
+          <w:sz w:val="24"/>
+          <w:szCs w:val="24"/>
+        </w:rPr>
+        <w:t xml:space="preserve"/>
+      </w:r>
+    </w:p>
+    <w:p>
+      <w:pPr>
+        <w:ind w:firstLine="709"/>
+        <w:spacing w:line="360" w:lineRule="auto" w:after="120"/>
+      </w:pPr>
+      <w:r>
+        <w:rPr>
+          <w:rFonts w:ascii="Times New Roman" w:hAnsi="Times New Roman" w:cs="Times New Roman"/>
+          <w:sz w:val="24"/>
+          <w:szCs w:val="24"/>
+        </w:rPr>
+        <w:t xml:space="preserve">Фактично проєкт можна описати як відкриту експериментальну micro-version сучасного WFM suite: він не конкурує з enterprise platforms за повнотою функцій, але відтворює їхню ключову логіку у контрольованому академічному середовищі. Саме це робить його придатним для магістерського інженерного проєкту: є working artifact, архітектура, codebase, database, model pipeline, optimization module, UI, screenshots, validation і reproducibility.</w:t>
+      </w:r>
+    </w:p>
+    <w:p>
+      <w:pPr>
+        <w:spacing w:line="360" w:lineRule="auto" w:after="120"/>
+      </w:pPr>
+      <w:r>
+        <w:rPr>
+          <w:rFonts w:ascii="Times New Roman" w:hAnsi="Times New Roman" w:cs="Times New Roman"/>
+          <w:sz w:val="24"/>
+          <w:szCs w:val="24"/>
+        </w:rPr>
+        <w:t xml:space="preserve"/>
+      </w:r>
+    </w:p>
+    <w:p>
+      <w:pPr>
+        <w:ind w:firstLine="709"/>
+        <w:spacing w:line="360" w:lineRule="auto" w:after="120"/>
+      </w:pPr>
+      <w:r>
+        <w:rPr>
+          <w:rFonts w:ascii="Times New Roman" w:hAnsi="Times New Roman" w:cs="Times New Roman"/>
+          <w:sz w:val="24"/>
+          <w:szCs w:val="24"/>
+        </w:rPr>
+        <w:t xml:space="preserve">Тому цей проєкт не слід позиціонувати як фундаментальне академічне дослідження нового математичного методу. Його коректніше позиціонувати як магістерський інженерний проєкт: створення працюючого software/data product, який реалізує відомий клас задач у конкретному domain, з конкретною архітектурою, data pipeline, model comparison, staffing engine, schedule optimizer, dashboard, validation artifacts і документацією. Для інженерного проєкту новизна може полягати не у винайденні нового алгоритму, а в інтеграції, адаптації, прозорості, відтворюваності та корисності продукту для певного сценарію.</w:t>
       </w:r>
     </w:p>
     <w:p>
@@ -2758,7 +2920,7 @@
                 <w:sz w:val="24"/>
                 <w:szCs w:val="24"/>
               </w:rPr>
-              <w:t xml:space="preserve">Глибока інтеграція з contact-center platform</w:t>
+              <w:t xml:space="preserve">Глибока інтеграція з contact-center platform і routing</w:t>
             </w:r>
           </w:p>
         </w:tc>
@@ -2914,7 +3076,7 @@
                 <w:sz w:val="24"/>
                 <w:szCs w:val="24"/>
               </w:rPr>
-              <w:t xml:space="preserve">Cloud-native, інтеграція з AWS ecosystem</w:t>
+              <w:t xml:space="preserve">Cloud-native, інтеграція з AWS ecosystem, capacity planning workflows</w:t>
             </w:r>
           </w:p>
         </w:tc>
@@ -3051,26 +3213,26 @@
                 <w:sz w:val="24"/>
                 <w:szCs w:val="24"/>
               </w:rPr>
-              <w:t xml:space="preserve">Forecasting, optimized scheduling, intraday optimization, agent engagement</w:t>
-            </w:r>
-          </w:p>
-        </w:tc>
-        <w:tc>
-          <w:tcPr>
-            <w:tcW w:w="2400" w:type="dxa"/>
-          </w:tcPr>
-          <w:p>
-            <w:pPr>
-              <w:ind w:firstLine="709"/>
-              <w:spacing w:line="360" w:lineRule="auto" w:after="120"/>
-            </w:pPr>
-            <w:r>
-              <w:rPr>
-                <w:rFonts w:ascii="Times New Roman" w:hAnsi="Times New Roman" w:cs="Times New Roman"/>
-                <w:sz w:val="24"/>
-                <w:szCs w:val="24"/>
-              </w:rPr>
-              <w:t xml:space="preserve">Сильна орієнтація на scheduling quality та agent experience</w:t>
+              <w:t xml:space="preserve">Forecasting, optimized scheduling, intraday management, agent engagement</w:t>
+            </w:r>
+          </w:p>
+        </w:tc>
+        <w:tc>
+          <w:tcPr>
+            <w:tcW w:w="2400" w:type="dxa"/>
+          </w:tcPr>
+          <w:p>
+            <w:pPr>
+              <w:ind w:firstLine="709"/>
+              <w:spacing w:line="360" w:lineRule="auto" w:after="120"/>
+            </w:pPr>
+            <w:r>
+              <w:rPr>
+                <w:rFonts w:ascii="Times New Roman" w:hAnsi="Times New Roman" w:cs="Times New Roman"/>
+                <w:sz w:val="24"/>
+                <w:szCs w:val="24"/>
+              </w:rPr>
+              <w:t xml:space="preserve">Сильна орієнтація на scheduling quality, agility та agent experience</w:t>
             </w:r>
           </w:p>
         </w:tc>
@@ -3148,7 +3310,7 @@
                 <w:sz w:val="24"/>
                 <w:szCs w:val="24"/>
               </w:rPr>
-              <w:t xml:space="preserve">Contact-center suite with WFM module</w:t>
+              <w:t xml:space="preserve">Contact-center suite with WFM module and WFO context</w:t>
             </w:r>
           </w:p>
         </w:tc>
@@ -3385,6 +3547,20 @@
           <w:sz w:val="24"/>
           <w:szCs w:val="24"/>
         </w:rPr>
+        <w:t xml:space="preserve">• він дає можливість порівнювати різні forecasting models і використовувати обрану модель у planning pipeline;</w:t>
+      </w:r>
+    </w:p>
+    <w:p>
+      <w:pPr>
+        <w:ind w:left="720" w:hanging="360"/>
+        <w:spacing w:line="360" w:lineRule="auto" w:after="120"/>
+      </w:pPr>
+      <w:r>
+        <w:rPr>
+          <w:rFonts w:ascii="Times New Roman" w:hAnsi="Times New Roman" w:cs="Times New Roman"/>
+          <w:sz w:val="24"/>
+          <w:szCs w:val="24"/>
+        </w:rPr>
         <w:t xml:space="preserve">• він підходить для навчальної, дослідницької та prototype demonstration мети;</w:t>
       </w:r>
     </w:p>
@@ -3400,6 +3576,33 @@
           <w:szCs w:val="24"/>
         </w:rPr>
         <w:t xml:space="preserve">• він може бути адаптований для інших public-service або healthcare scenarios.</w:t>
+      </w:r>
+    </w:p>
+    <w:p>
+      <w:pPr>
+        <w:spacing w:line="360" w:lineRule="auto" w:after="120"/>
+      </w:pPr>
+      <w:r>
+        <w:rPr>
+          <w:rFonts w:ascii="Times New Roman" w:hAnsi="Times New Roman" w:cs="Times New Roman"/>
+          <w:sz w:val="24"/>
+          <w:szCs w:val="24"/>
+        </w:rPr>
+        <w:t xml:space="preserve"/>
+      </w:r>
+    </w:p>
+    <w:p>
+      <w:pPr>
+        <w:ind w:firstLine="709"/>
+        <w:spacing w:line="360" w:lineRule="auto" w:after="120"/>
+      </w:pPr>
+      <w:r>
+        <w:rPr>
+          <w:rFonts w:ascii="Times New Roman" w:hAnsi="Times New Roman" w:cs="Times New Roman"/>
+          <w:sz w:val="24"/>
+          <w:szCs w:val="24"/>
+        </w:rPr>
+        <w:t xml:space="preserve">Таким чином, наявність конкурентів не зменшує цінність проєкту. Вона показує, що задача реальна, а запропонований продукт є open, explainable і reproducible аналогом enterprise workflow для навчання, демонстрації та подальших експериментів.</w:t>
       </w:r>
     </w:p>
     <w:p>
@@ -3741,7 +3944,21 @@
           <w:sz w:val="24"/>
           <w:szCs w:val="24"/>
         </w:rPr>
-        <w:t xml:space="preserve">• explicit reporting of coverage gap для constrained 160-agent scenario.</w:t>
+        <w:t xml:space="preserve">• explicit reporting of coverage gap для constrained 160-agent scenario;</w:t>
+      </w:r>
+    </w:p>
+    <w:p>
+      <w:pPr>
+        <w:ind w:left="720" w:hanging="360"/>
+        <w:spacing w:line="360" w:lineRule="auto" w:after="120"/>
+      </w:pPr>
+      <w:r>
+        <w:rPr>
+          <w:rFonts w:ascii="Times New Roman" w:hAnsi="Times New Roman" w:cs="Times New Roman"/>
+          <w:sz w:val="24"/>
+          <w:szCs w:val="24"/>
+        </w:rPr>
+        <w:t xml:space="preserve">• model registry, який дозволяє додавати нові forecasting models і порівнювати їх у dashboard.</w:t>
       </w:r>
     </w:p>
     <w:p>
@@ -3809,6 +4026,20 @@
           <w:sz w:val="24"/>
           <w:szCs w:val="24"/>
         </w:rPr>
+        <w:t xml:space="preserve">• порівняти Erlang C з Erlang A та discrete-event simulation для сценаріїв з abandonment;</w:t>
+      </w:r>
+    </w:p>
+    <w:p>
+      <w:pPr>
+        <w:ind w:left="720" w:hanging="360"/>
+        <w:spacing w:line="360" w:lineRule="auto" w:after="120"/>
+      </w:pPr>
+      <w:r>
+        <w:rPr>
+          <w:rFonts w:ascii="Times New Roman" w:hAnsi="Times New Roman" w:cs="Times New Roman"/>
+          <w:sz w:val="24"/>
+          <w:szCs w:val="24"/>
+        </w:rPr>
         <w:t xml:space="preserve">• додати weather, city events і emergency indicators як exogenous forecast features;</w:t>
       </w:r>
     </w:p>
@@ -3823,7 +4054,35 @@
           <w:sz w:val="24"/>
           <w:szCs w:val="24"/>
         </w:rPr>
+        <w:t xml:space="preserve">• додати intraday re-forecasting, коли модель оновлює прогноз протягом дня;</w:t>
+      </w:r>
+    </w:p>
+    <w:p>
+      <w:pPr>
+        <w:ind w:left="720" w:hanging="360"/>
+        <w:spacing w:line="360" w:lineRule="auto" w:after="120"/>
+      </w:pPr>
+      <w:r>
+        <w:rPr>
+          <w:rFonts w:ascii="Times New Roman" w:hAnsi="Times New Roman" w:cs="Times New Roman"/>
+          <w:sz w:val="24"/>
+          <w:szCs w:val="24"/>
+        </w:rPr>
         <w:t xml:space="preserve">• реалізувати skill-based multiqueue scheduling;</w:t>
+      </w:r>
+    </w:p>
+    <w:p>
+      <w:pPr>
+        <w:ind w:left="720" w:hanging="360"/>
+        <w:spacing w:line="360" w:lineRule="auto" w:after="120"/>
+      </w:pPr>
+      <w:r>
+        <w:rPr>
+          <w:rFonts w:ascii="Times New Roman" w:hAnsi="Times New Roman" w:cs="Times New Roman"/>
+          <w:sz w:val="24"/>
+          <w:szCs w:val="24"/>
+        </w:rPr>
+        <w:t xml:space="preserve">• додати agent-centric constraints: preferences, fairness, consecutive working days, shift bidding;</w:t>
       </w:r>
     </w:p>
     <w:p>
@@ -5863,6 +6122,33 @@
           <w:szCs w:val="24"/>
         </w:rPr>
         <w:t xml:space="preserve">Було порівняно seasonal naive baseline, ridge regression, Poisson regression, gradient boosting, random forest і histogram gradient boosting. Обрано histogram gradient boosting як модель з найнижчим MAE на full-history holdout.</w:t>
+      </w:r>
+    </w:p>
+    <w:p>
+      <w:pPr>
+        <w:spacing w:line="360" w:lineRule="auto" w:after="120"/>
+      </w:pPr>
+      <w:r>
+        <w:rPr>
+          <w:rFonts w:ascii="Times New Roman" w:hAnsi="Times New Roman" w:cs="Times New Roman"/>
+          <w:sz w:val="24"/>
+          <w:szCs w:val="24"/>
+        </w:rPr>
+        <w:t xml:space="preserve"/>
+      </w:r>
+    </w:p>
+    <w:p>
+      <w:pPr>
+        <w:ind w:firstLine="709"/>
+        <w:spacing w:line="360" w:lineRule="auto" w:after="120"/>
+      </w:pPr>
+      <w:r>
+        <w:rPr>
+          <w:rFonts w:ascii="Times New Roman" w:hAnsi="Times New Roman" w:cs="Times New Roman"/>
+          <w:sz w:val="24"/>
+          <w:szCs w:val="24"/>
+        </w:rPr>
+        <w:t xml:space="preserve">Моделі організовані як registry у функції model_candidates(). Це означає, що нову модель можна додати як окремий named estimator, після чого її можна включити в holdout comparison і future planning scenario. Planning pipeline має параметр -Model, тому прогноз, staffing та schedule можуть бути перераховані для іншої моделі без зміни архітектури.</w:t>
       </w:r>
     </w:p>
     <w:p>
@@ -8540,6 +8826,33 @@
     </w:p>
     <w:p>
       <w:pPr>
+        <w:ind w:firstLine="709"/>
+        <w:spacing w:line="360" w:lineRule="auto" w:after="120"/>
+      </w:pPr>
+      <w:r>
+        <w:rPr>
+          <w:rFonts w:ascii="Times New Roman" w:hAnsi="Times New Roman" w:cs="Times New Roman"/>
+          <w:sz w:val="24"/>
+          <w:szCs w:val="24"/>
+        </w:rPr>
+        <w:t xml:space="preserve">Dashboard також візуалізує interval-level holdout predictions для кількох моделей. Це важливо для planning workflow, тому що різні моделі можуть мати схожу середню помилку, але по-різному поводитися у peak intervals.</w:t>
+      </w:r>
+    </w:p>
+    <w:p>
+      <w:pPr>
+        <w:spacing w:line="360" w:lineRule="auto" w:after="120"/>
+      </w:pPr>
+      <w:r>
+        <w:rPr>
+          <w:rFonts w:ascii="Times New Roman" w:hAnsi="Times New Roman" w:cs="Times New Roman"/>
+          <w:sz w:val="24"/>
+          <w:szCs w:val="24"/>
+        </w:rPr>
+        <w:t xml:space="preserve"/>
+      </w:r>
+    </w:p>
+    <w:p>
+      <w:pPr>
         <w:pStyle w:val="Heading3"/>
         <w:spacing w:before="240" w:after="160"/>
       </w:pPr>
@@ -8859,6 +9172,448 @@
     </w:p>
     <w:p>
       <w:pPr>
+        <w:ind w:firstLine="709"/>
+        <w:spacing w:line="360" w:lineRule="auto" w:after="120"/>
+      </w:pPr>
+      <w:r>
+        <w:rPr>
+          <w:rFonts w:ascii="Times New Roman" w:hAnsi="Times New Roman" w:cs="Times New Roman"/>
+          <w:sz w:val="24"/>
+          <w:szCs w:val="24"/>
+        </w:rPr>
+        <w:t xml:space="preserve">Додатково сформовано future model scenario comparison для всіх зареєстрованих моделей:</w:t>
+      </w:r>
+    </w:p>
+    <w:p>
+      <w:pPr>
+        <w:spacing w:line="360" w:lineRule="auto" w:after="120"/>
+      </w:pPr>
+      <w:r>
+        <w:rPr>
+          <w:rFonts w:ascii="Times New Roman" w:hAnsi="Times New Roman" w:cs="Times New Roman"/>
+          <w:sz w:val="24"/>
+          <w:szCs w:val="24"/>
+        </w:rPr>
+        <w:t xml:space="preserve"/>
+      </w:r>
+    </w:p>
+    <w:tbl>
+      <w:tblPr>
+        <w:tblW w:w="0" w:type="auto"/>
+        <w:tblBorders>
+          <w:top w:val="single" w:sz="4" w:space="0" w:color="808080"/>
+          <w:left w:val="single" w:sz="4" w:space="0" w:color="808080"/>
+          <w:bottom w:val="single" w:sz="4" w:space="0" w:color="808080"/>
+          <w:right w:val="single" w:sz="4" w:space="0" w:color="808080"/>
+          <w:insideH w:val="single" w:sz="4" w:space="0" w:color="808080"/>
+          <w:insideV w:val="single" w:sz="4" w:space="0" w:color="808080"/>
+        </w:tblBorders>
+      </w:tblPr>
+      <w:tblGrid>
+        <w:gridCol w:w="2400"/>
+        <w:gridCol w:w="2400"/>
+        <w:gridCol w:w="2400"/>
+      </w:tblGrid>
+      <w:tr>
+        <w:tc>
+          <w:tcPr>
+            <w:tcW w:w="2400" w:type="dxa"/>
+          </w:tcPr>
+          <w:p>
+            <w:pPr>
+              <w:ind w:firstLine="709"/>
+              <w:spacing w:line="360" w:lineRule="auto" w:after="120"/>
+            </w:pPr>
+            <w:r>
+              <w:rPr>
+                <w:rFonts w:ascii="Times New Roman" w:hAnsi="Times New Roman" w:cs="Times New Roman"/>
+                <w:sz w:val="24"/>
+                <w:szCs w:val="24"/>
+                <w:b/>
+              </w:rPr>
+              <w:t xml:space="preserve">Model</w:t>
+            </w:r>
+          </w:p>
+        </w:tc>
+        <w:tc>
+          <w:tcPr>
+            <w:tcW w:w="2400" w:type="dxa"/>
+          </w:tcPr>
+          <w:p>
+            <w:pPr>
+              <w:ind w:firstLine="709"/>
+              <w:spacing w:line="360" w:lineRule="auto" w:after="120"/>
+            </w:pPr>
+            <w:r>
+              <w:rPr>
+                <w:rFonts w:ascii="Times New Roman" w:hAnsi="Times New Roman" w:cs="Times New Roman"/>
+                <w:sz w:val="24"/>
+                <w:szCs w:val="24"/>
+                <w:b/>
+              </w:rPr>
+              <w:t xml:space="preserve">Average predicted calls</w:t>
+            </w:r>
+          </w:p>
+        </w:tc>
+        <w:tc>
+          <w:tcPr>
+            <w:tcW w:w="2400" w:type="dxa"/>
+          </w:tcPr>
+          <w:p>
+            <w:pPr>
+              <w:ind w:firstLine="709"/>
+              <w:spacing w:line="360" w:lineRule="auto" w:after="120"/>
+            </w:pPr>
+            <w:r>
+              <w:rPr>
+                <w:rFonts w:ascii="Times New Roman" w:hAnsi="Times New Roman" w:cs="Times New Roman"/>
+                <w:sz w:val="24"/>
+                <w:szCs w:val="24"/>
+                <w:b/>
+              </w:rPr>
+              <w:t xml:space="preserve">Peak predicted calls</w:t>
+            </w:r>
+          </w:p>
+        </w:tc>
+      </w:tr>
+      <w:tr>
+        <w:tc>
+          <w:tcPr>
+            <w:tcW w:w="2400" w:type="dxa"/>
+          </w:tcPr>
+          <w:p>
+            <w:pPr>
+              <w:ind w:firstLine="709"/>
+              <w:spacing w:line="360" w:lineRule="auto" w:after="120"/>
+            </w:pPr>
+            <w:r>
+              <w:rPr>
+                <w:rFonts w:ascii="Times New Roman" w:hAnsi="Times New Roman" w:cs="Times New Roman"/>
+                <w:sz w:val="24"/>
+                <w:szCs w:val="24"/>
+              </w:rPr>
+              <w:t xml:space="preserve">Random forest</w:t>
+            </w:r>
+          </w:p>
+        </w:tc>
+        <w:tc>
+          <w:tcPr>
+            <w:tcW w:w="2400" w:type="dxa"/>
+          </w:tcPr>
+          <w:p>
+            <w:pPr>
+              <w:ind w:firstLine="709"/>
+              <w:spacing w:line="360" w:lineRule="auto" w:after="120"/>
+            </w:pPr>
+            <w:r>
+              <w:rPr>
+                <w:rFonts w:ascii="Times New Roman" w:hAnsi="Times New Roman" w:cs="Times New Roman"/>
+                <w:sz w:val="24"/>
+                <w:szCs w:val="24"/>
+              </w:rPr>
+              <w:t xml:space="preserve">208.1176</w:t>
+            </w:r>
+          </w:p>
+        </w:tc>
+        <w:tc>
+          <w:tcPr>
+            <w:tcW w:w="2400" w:type="dxa"/>
+          </w:tcPr>
+          <w:p>
+            <w:pPr>
+              <w:ind w:firstLine="709"/>
+              <w:spacing w:line="360" w:lineRule="auto" w:after="120"/>
+            </w:pPr>
+            <w:r>
+              <w:rPr>
+                <w:rFonts w:ascii="Times New Roman" w:hAnsi="Times New Roman" w:cs="Times New Roman"/>
+                <w:sz w:val="24"/>
+                <w:szCs w:val="24"/>
+              </w:rPr>
+              <w:t xml:space="preserve">448.0598</w:t>
+            </w:r>
+          </w:p>
+        </w:tc>
+      </w:tr>
+      <w:tr>
+        <w:tc>
+          <w:tcPr>
+            <w:tcW w:w="2400" w:type="dxa"/>
+          </w:tcPr>
+          <w:p>
+            <w:pPr>
+              <w:ind w:firstLine="709"/>
+              <w:spacing w:line="360" w:lineRule="auto" w:after="120"/>
+            </w:pPr>
+            <w:r>
+              <w:rPr>
+                <w:rFonts w:ascii="Times New Roman" w:hAnsi="Times New Roman" w:cs="Times New Roman"/>
+                <w:sz w:val="24"/>
+                <w:szCs w:val="24"/>
+              </w:rPr>
+              <w:t xml:space="preserve">Histogram gradient boosting</w:t>
+            </w:r>
+          </w:p>
+        </w:tc>
+        <w:tc>
+          <w:tcPr>
+            <w:tcW w:w="2400" w:type="dxa"/>
+          </w:tcPr>
+          <w:p>
+            <w:pPr>
+              <w:ind w:firstLine="709"/>
+              <w:spacing w:line="360" w:lineRule="auto" w:after="120"/>
+            </w:pPr>
+            <w:r>
+              <w:rPr>
+                <w:rFonts w:ascii="Times New Roman" w:hAnsi="Times New Roman" w:cs="Times New Roman"/>
+                <w:sz w:val="24"/>
+                <w:szCs w:val="24"/>
+              </w:rPr>
+              <w:t xml:space="preserve">204.4150</w:t>
+            </w:r>
+          </w:p>
+        </w:tc>
+        <w:tc>
+          <w:tcPr>
+            <w:tcW w:w="2400" w:type="dxa"/>
+          </w:tcPr>
+          <w:p>
+            <w:pPr>
+              <w:ind w:firstLine="709"/>
+              <w:spacing w:line="360" w:lineRule="auto" w:after="120"/>
+            </w:pPr>
+            <w:r>
+              <w:rPr>
+                <w:rFonts w:ascii="Times New Roman" w:hAnsi="Times New Roman" w:cs="Times New Roman"/>
+                <w:sz w:val="24"/>
+                <w:szCs w:val="24"/>
+              </w:rPr>
+              <w:t xml:space="preserve">386.1923</w:t>
+            </w:r>
+          </w:p>
+        </w:tc>
+      </w:tr>
+      <w:tr>
+        <w:tc>
+          <w:tcPr>
+            <w:tcW w:w="2400" w:type="dxa"/>
+          </w:tcPr>
+          <w:p>
+            <w:pPr>
+              <w:ind w:firstLine="709"/>
+              <w:spacing w:line="360" w:lineRule="auto" w:after="120"/>
+            </w:pPr>
+            <w:r>
+              <w:rPr>
+                <w:rFonts w:ascii="Times New Roman" w:hAnsi="Times New Roman" w:cs="Times New Roman"/>
+                <w:sz w:val="24"/>
+                <w:szCs w:val="24"/>
+              </w:rPr>
+              <w:t xml:space="preserve">Gradient boosting</w:t>
+            </w:r>
+          </w:p>
+        </w:tc>
+        <w:tc>
+          <w:tcPr>
+            <w:tcW w:w="2400" w:type="dxa"/>
+          </w:tcPr>
+          <w:p>
+            <w:pPr>
+              <w:ind w:firstLine="709"/>
+              <w:spacing w:line="360" w:lineRule="auto" w:after="120"/>
+            </w:pPr>
+            <w:r>
+              <w:rPr>
+                <w:rFonts w:ascii="Times New Roman" w:hAnsi="Times New Roman" w:cs="Times New Roman"/>
+                <w:sz w:val="24"/>
+                <w:szCs w:val="24"/>
+              </w:rPr>
+              <w:t xml:space="preserve">199.0700</w:t>
+            </w:r>
+          </w:p>
+        </w:tc>
+        <w:tc>
+          <w:tcPr>
+            <w:tcW w:w="2400" w:type="dxa"/>
+          </w:tcPr>
+          <w:p>
+            <w:pPr>
+              <w:ind w:firstLine="709"/>
+              <w:spacing w:line="360" w:lineRule="auto" w:after="120"/>
+            </w:pPr>
+            <w:r>
+              <w:rPr>
+                <w:rFonts w:ascii="Times New Roman" w:hAnsi="Times New Roman" w:cs="Times New Roman"/>
+                <w:sz w:val="24"/>
+                <w:szCs w:val="24"/>
+              </w:rPr>
+              <w:t xml:space="preserve">331.4391</w:t>
+            </w:r>
+          </w:p>
+        </w:tc>
+      </w:tr>
+      <w:tr>
+        <w:tc>
+          <w:tcPr>
+            <w:tcW w:w="2400" w:type="dxa"/>
+          </w:tcPr>
+          <w:p>
+            <w:pPr>
+              <w:ind w:firstLine="709"/>
+              <w:spacing w:line="360" w:lineRule="auto" w:after="120"/>
+            </w:pPr>
+            <w:r>
+              <w:rPr>
+                <w:rFonts w:ascii="Times New Roman" w:hAnsi="Times New Roman" w:cs="Times New Roman"/>
+                <w:sz w:val="24"/>
+                <w:szCs w:val="24"/>
+              </w:rPr>
+              <w:t xml:space="preserve">Ridge regression</w:t>
+            </w:r>
+          </w:p>
+        </w:tc>
+        <w:tc>
+          <w:tcPr>
+            <w:tcW w:w="2400" w:type="dxa"/>
+          </w:tcPr>
+          <w:p>
+            <w:pPr>
+              <w:ind w:firstLine="709"/>
+              <w:spacing w:line="360" w:lineRule="auto" w:after="120"/>
+            </w:pPr>
+            <w:r>
+              <w:rPr>
+                <w:rFonts w:ascii="Times New Roman" w:hAnsi="Times New Roman" w:cs="Times New Roman"/>
+                <w:sz w:val="24"/>
+                <w:szCs w:val="24"/>
+              </w:rPr>
+              <w:t xml:space="preserve">191.1717</w:t>
+            </w:r>
+          </w:p>
+        </w:tc>
+        <w:tc>
+          <w:tcPr>
+            <w:tcW w:w="2400" w:type="dxa"/>
+          </w:tcPr>
+          <w:p>
+            <w:pPr>
+              <w:ind w:firstLine="709"/>
+              <w:spacing w:line="360" w:lineRule="auto" w:after="120"/>
+            </w:pPr>
+            <w:r>
+              <w:rPr>
+                <w:rFonts w:ascii="Times New Roman" w:hAnsi="Times New Roman" w:cs="Times New Roman"/>
+                <w:sz w:val="24"/>
+                <w:szCs w:val="24"/>
+              </w:rPr>
+              <w:t xml:space="preserve">324.4033</w:t>
+            </w:r>
+          </w:p>
+        </w:tc>
+      </w:tr>
+      <w:tr>
+        <w:tc>
+          <w:tcPr>
+            <w:tcW w:w="2400" w:type="dxa"/>
+          </w:tcPr>
+          <w:p>
+            <w:pPr>
+              <w:ind w:firstLine="709"/>
+              <w:spacing w:line="360" w:lineRule="auto" w:after="120"/>
+            </w:pPr>
+            <w:r>
+              <w:rPr>
+                <w:rFonts w:ascii="Times New Roman" w:hAnsi="Times New Roman" w:cs="Times New Roman"/>
+                <w:sz w:val="24"/>
+                <w:szCs w:val="24"/>
+              </w:rPr>
+              <w:t xml:space="preserve">Poisson regression</w:t>
+            </w:r>
+          </w:p>
+        </w:tc>
+        <w:tc>
+          <w:tcPr>
+            <w:tcW w:w="2400" w:type="dxa"/>
+          </w:tcPr>
+          <w:p>
+            <w:pPr>
+              <w:ind w:firstLine="709"/>
+              <w:spacing w:line="360" w:lineRule="auto" w:after="120"/>
+            </w:pPr>
+            <w:r>
+              <w:rPr>
+                <w:rFonts w:ascii="Times New Roman" w:hAnsi="Times New Roman" w:cs="Times New Roman"/>
+                <w:sz w:val="24"/>
+                <w:szCs w:val="24"/>
+              </w:rPr>
+              <w:t xml:space="preserve">185.3209</w:t>
+            </w:r>
+          </w:p>
+        </w:tc>
+        <w:tc>
+          <w:tcPr>
+            <w:tcW w:w="2400" w:type="dxa"/>
+          </w:tcPr>
+          <w:p>
+            <w:pPr>
+              <w:ind w:firstLine="709"/>
+              <w:spacing w:line="360" w:lineRule="auto" w:after="120"/>
+            </w:pPr>
+            <w:r>
+              <w:rPr>
+                <w:rFonts w:ascii="Times New Roman" w:hAnsi="Times New Roman" w:cs="Times New Roman"/>
+                <w:sz w:val="24"/>
+                <w:szCs w:val="24"/>
+              </w:rPr>
+              <w:t xml:space="preserve">391.6900</w:t>
+            </w:r>
+          </w:p>
+        </w:tc>
+      </w:tr>
+    </w:tbl>
+    <w:p>
+      <w:pPr>
+        <w:spacing w:line="360" w:lineRule="auto" w:after="120"/>
+      </w:pPr>
+      <w:r>
+        <w:rPr>
+          <w:rFonts w:ascii="Times New Roman" w:hAnsi="Times New Roman" w:cs="Times New Roman"/>
+          <w:sz w:val="24"/>
+          <w:szCs w:val="24"/>
+        </w:rPr>
+        <w:t xml:space="preserve"/>
+      </w:r>
+    </w:p>
+    <w:p>
+      <w:pPr>
+        <w:ind w:firstLine="709"/>
+        <w:spacing w:line="360" w:lineRule="auto" w:after="120"/>
+      </w:pPr>
+      <w:r>
+        <w:rPr>
+          <w:rFonts w:ascii="Times New Roman" w:hAnsi="Times New Roman" w:cs="Times New Roman"/>
+          <w:sz w:val="24"/>
+          <w:szCs w:val="24"/>
+        </w:rPr>
+        <w:t xml:space="preserve">Це розширює продукт від single-model forecast до model-aware planning tool: користувач може оцінити, як зміна моделі впливає на майбутній demand curve, перш ніж перераховувати staffing і schedule.</w:t>
+      </w:r>
+    </w:p>
+    <w:p>
+      <w:pPr>
+        <w:spacing w:line="360" w:lineRule="auto" w:after="120"/>
+      </w:pPr>
+      <w:r>
+        <w:rPr>
+          <w:rFonts w:ascii="Times New Roman" w:hAnsi="Times New Roman" w:cs="Times New Roman"/>
+          <w:sz w:val="24"/>
+          <w:szCs w:val="24"/>
+        </w:rPr>
+        <w:t xml:space="preserve"/>
+      </w:r>
+    </w:p>
+    <w:p>
+      <w:pPr>
         <w:pStyle w:val="Heading3"/>
         <w:spacing w:before="240" w:after="160"/>
       </w:pPr>
@@ -11170,6 +11925,20 @@
           <w:sz w:val="24"/>
           <w:szCs w:val="24"/>
         </w:rPr>
+        <w:t xml:space="preserve">• додано model scenario comparison для planning forecast;</w:t>
+      </w:r>
+    </w:p>
+    <w:p>
+      <w:pPr>
+        <w:ind w:left="720" w:hanging="360"/>
+        <w:spacing w:line="360" w:lineRule="auto" w:after="120"/>
+      </w:pPr>
+      <w:r>
+        <w:rPr>
+          <w:rFonts w:ascii="Times New Roman" w:hAnsi="Times New Roman" w:cs="Times New Roman"/>
+          <w:sz w:val="24"/>
+          <w:szCs w:val="24"/>
+        </w:rPr>
         <w:t xml:space="preserve">• створено January 2026 future forecast;</w:t>
       </w:r>
     </w:p>
@@ -11725,6 +12494,90 @@
           <w:szCs w:val="24"/>
         </w:rPr>
         <w:t xml:space="preserve">16. Google OR-Tools documentation. https://developers.google.com/optimization</w:t>
+      </w:r>
+    </w:p>
+    <w:p>
+      <w:pPr>
+        <w:ind w:left="720" w:hanging="360"/>
+        <w:spacing w:line="360" w:lineRule="auto" w:after="120"/>
+      </w:pPr>
+      <w:r>
+        <w:rPr>
+          <w:rFonts w:ascii="Times New Roman" w:hAnsi="Times New Roman" w:cs="Times New Roman"/>
+          <w:sz w:val="24"/>
+          <w:szCs w:val="24"/>
+        </w:rPr>
+        <w:t xml:space="preserve">17. Brown, L., Gans, N., Mandelbaum, A., Sakov, A., Shen, H., Zeltyn, S., Zhao, L. Statistical Analysis of a Telephone Call Center: A Queueing-Science Perspective. Journal of the American Statistical Association, 2005. https://doi.org/10.1198/016214504000001808</w:t>
+      </w:r>
+    </w:p>
+    <w:p>
+      <w:pPr>
+        <w:ind w:left="720" w:hanging="360"/>
+        <w:spacing w:line="360" w:lineRule="auto" w:after="120"/>
+      </w:pPr>
+      <w:r>
+        <w:rPr>
+          <w:rFonts w:ascii="Times New Roman" w:hAnsi="Times New Roman" w:cs="Times New Roman"/>
+          <w:sz w:val="24"/>
+          <w:szCs w:val="24"/>
+        </w:rPr>
+        <w:t xml:space="preserve">18. Ibrahim, R., L'Ecuyer, P. Forecasting Call Center Arrivals: Fixed-Effects, Mixed-Effects, and Bivariate Models. Manufacturing &amp; Service Operations Management, 2013. https://doi.org/10.1287/msom.1120.0405</w:t>
+      </w:r>
+    </w:p>
+    <w:p>
+      <w:pPr>
+        <w:ind w:left="720" w:hanging="360"/>
+        <w:spacing w:line="360" w:lineRule="auto" w:after="120"/>
+      </w:pPr>
+      <w:r>
+        <w:rPr>
+          <w:rFonts w:ascii="Times New Roman" w:hAnsi="Times New Roman" w:cs="Times New Roman"/>
+          <w:sz w:val="24"/>
+          <w:szCs w:val="24"/>
+        </w:rPr>
+        <w:t xml:space="preserve">19. Boulin, J. M. Call Center Demand Forecasting: Improving Sales Calls Prediction Accuracy Through the Combination of Statistical Methods and Judgmental Forecast. MIT, 2010. http://hdl.handle.net/1721.1/59159</w:t>
+      </w:r>
+    </w:p>
+    <w:p>
+      <w:pPr>
+        <w:ind w:left="720" w:hanging="360"/>
+        <w:spacing w:line="360" w:lineRule="auto" w:after="120"/>
+      </w:pPr>
+      <w:r>
+        <w:rPr>
+          <w:rFonts w:ascii="Times New Roman" w:hAnsi="Times New Roman" w:cs="Times New Roman"/>
+          <w:sz w:val="24"/>
+          <w:szCs w:val="24"/>
+        </w:rPr>
+        <w:t xml:space="preserve">20. Manno, A., Rossi, F., Smriglio, S., Cerone, L. Comparing deep and shallow neural networks in forecasting call center arrivals. Soft Computing, 2022. https://doi.org/10.1007/s00500-022-07055-2</w:t>
+      </w:r>
+    </w:p>
+    <w:p>
+      <w:pPr>
+        <w:ind w:left="720" w:hanging="360"/>
+        <w:spacing w:line="360" w:lineRule="auto" w:after="120"/>
+      </w:pPr>
+      <w:r>
+        <w:rPr>
+          <w:rFonts w:ascii="Times New Roman" w:hAnsi="Times New Roman" w:cs="Times New Roman"/>
+          <w:sz w:val="24"/>
+          <w:szCs w:val="24"/>
+        </w:rPr>
+        <w:t xml:space="preserve">21. Robbins, T. R., Medeiros, D. J. Does the Erlang C model fit in real call centers? Winter Simulation Conference, 2010. https://pure.psu.edu/en/publications/does-the-erlang-c-model-fit-in-real-call-centers/</w:t>
+      </w:r>
+    </w:p>
+    <w:p>
+      <w:pPr>
+        <w:ind w:left="720" w:hanging="360"/>
+        <w:spacing w:line="360" w:lineRule="auto" w:after="120"/>
+      </w:pPr>
+      <w:r>
+        <w:rPr>
+          <w:rFonts w:ascii="Times New Roman" w:hAnsi="Times New Roman" w:cs="Times New Roman"/>
+          <w:sz w:val="24"/>
+          <w:szCs w:val="24"/>
+        </w:rPr>
+        <w:t xml:space="preserve">22. Buriol, L. S., et al. Scheduling of agents in inbound multilingual call centers. Brazilian Journal of Operations &amp; Production Management, 2017. https://bjopm.org.br/bjopm/article/download/V14N2A11/html?inline=1</w:t>
       </w:r>
     </w:p>
     <w:p>

</xml_diff>

<commit_message>
Finalize portfolio deployment and documentation
</commit_message>
<xml_diff>
--- a/docs/final/Пояснювальна_записка_чернетка.docx
+++ b/docs/final/Пояснювальна_записка_чернетка.docx
@@ -3684,7 +3684,7 @@
           <w:sz w:val="24"/>
           <w:szCs w:val="24"/>
         </w:rPr>
-        <w:t xml:space="preserve">Для database layer обрано Microsoft SQL Server. Попри те, що для безкоштовного web deployment простіше було б використати PostgreSQL або SQLite, SQL Server є доречним для інженерного проєкту, оскільки він часто використовується в корпоративній аналітиці, підтримує надійне індексування, views, batch loading і зрозумілу star schema модель.</w:t>
+        <w:t xml:space="preserve">Для database layer обрано Microsoft SQL Server. Попри те, що для безкоштовного web deployment простіше було б використати PostgreSQL або SQLite, SQL Server є доречним для інженерного проєкту, оскільки він часто використовується в корпоративній аналітиці, підтримує надійне індексування, views, batch loading і зрозумілу star schema модель. Для публічної portfolio-демонстрації додано compact PostgreSQL runtime: dashboard читає підготовлені analytical seed tables, а повний SQL Server warehouse залишається canonical data engineering layer.</w:t>
       </w:r>
     </w:p>
     <w:p>
@@ -3963,6 +3963,20 @@
     </w:p>
     <w:p>
       <w:pPr>
+        <w:ind w:left="720" w:hanging="360"/>
+        <w:spacing w:line="360" w:lineRule="auto" w:after="120"/>
+      </w:pPr>
+      <w:r>
+        <w:rPr>
+          <w:rFonts w:ascii="Times New Roman" w:hAnsi="Times New Roman" w:cs="Times New Roman"/>
+          <w:sz w:val="24"/>
+          <w:szCs w:val="24"/>
+        </w:rPr>
+        <w:t xml:space="preserve">• публічний portfolio deployment через Docker Compose, PostgreSQL, Streamlit і Caddy HTTPS.</w:t>
+      </w:r>
+    </w:p>
+    <w:p>
+      <w:pPr>
         <w:spacing w:line="360" w:lineRule="auto" w:after="120"/>
       </w:pPr>
       <w:r>
@@ -4124,7 +4138,7 @@
           <w:sz w:val="24"/>
           <w:szCs w:val="24"/>
         </w:rPr>
-        <w:t xml:space="preserve">• підготувати cloud-friendly deployment на PostgreSQL або managed database;</w:t>
+        <w:t xml:space="preserve">• розширити deployment до managed database, monitoring і scheduled backups, якщо продукт виходитиме за межі portfolio demo;</w:t>
       </w:r>
     </w:p>
     <w:p>
@@ -6575,7 +6589,7 @@
           <w:sz w:val="24"/>
           <w:szCs w:val="24"/>
         </w:rPr>
-        <w:t xml:space="preserve">Dashboard читає SQL Server views, а для локальної демонстрації може використовувати generated CSV artifacts.</w:t>
+        <w:t xml:space="preserve">Dashboard читає SQL Server views, для локальної демонстрації може використовувати generated CSV artifacts, а для VPS portfolio deployment читає compact PostgreSQL seed tables. Публічна версія доступна через Caddy HTTPS із простим password gate.</w:t>
       </w:r>
     </w:p>
     <w:p>
@@ -6741,7 +6755,21 @@
           <w:sz w:val="24"/>
           <w:szCs w:val="24"/>
         </w:rPr>
-        <w:t xml:space="preserve">• dashboard screenshot validation для demo package.</w:t>
+        <w:t xml:space="preserve">• dashboard screenshot validation для demo package;</w:t>
+      </w:r>
+    </w:p>
+    <w:p>
+      <w:pPr>
+        <w:ind w:left="720" w:hanging="360"/>
+        <w:spacing w:line="360" w:lineRule="auto" w:after="120"/>
+      </w:pPr>
+      <w:r>
+        <w:rPr>
+          <w:rFonts w:ascii="Times New Roman" w:hAnsi="Times New Roman" w:cs="Times New Roman"/>
+          <w:sz w:val="24"/>
+          <w:szCs w:val="24"/>
+        </w:rPr>
+        <w:t xml:space="preserve">• public deployment smoke test.</w:t>
       </w:r>
     </w:p>
     <w:p>
@@ -6768,7 +6796,7 @@
           <w:sz w:val="24"/>
           <w:szCs w:val="24"/>
         </w:rPr>
-        <w:t xml:space="preserve">Автоматичні тести виконуються через pytest. Поточний результат: 10 tests passed.</w:t>
+        <w:t xml:space="preserve">Автоматичні тести виконуються через pytest. Поточний результат: 13 tests passed.</w:t>
       </w:r>
     </w:p>
     <w:p>
@@ -6920,7 +6948,21 @@
           <w:sz w:val="24"/>
           <w:szCs w:val="24"/>
         </w:rPr>
-        <w:t xml:space="preserve">• побудова schedule, який є legal, але чесно показує coverage gap.</w:t>
+        <w:t xml:space="preserve">• побудова schedule, який є legal, але чесно показує coverage gap;</w:t>
+      </w:r>
+    </w:p>
+    <w:p>
+      <w:pPr>
+        <w:ind w:left="720" w:hanging="360"/>
+        <w:spacing w:line="360" w:lineRule="auto" w:after="120"/>
+      </w:pPr>
+      <w:r>
+        <w:rPr>
+          <w:rFonts w:ascii="Times New Roman" w:hAnsi="Times New Roman" w:cs="Times New Roman"/>
+          <w:sz w:val="24"/>
+          <w:szCs w:val="24"/>
+        </w:rPr>
+        <w:t xml:space="preserve">• публічне розгортання продукту без перенесення повного SQL Server warehouse.</w:t>
       </w:r>
     </w:p>
     <w:p>
@@ -11028,6 +11070,33 @@
           <w:sz w:val="24"/>
           <w:szCs w:val="24"/>
         </w:rPr>
+        <w:t xml:space="preserve">Dashboard також має public portfolio mode: компактна Postgres database на VPS містить seed tables для основних analytical views, а Caddy публікує Streamlit через HTTPS endpoint https://wfm.vartsab.com:8443. Це дозволяє демонструвати продукт поза локальним комп'ютером без хостингу повного SQL Server warehouse.</w:t>
+      </w:r>
+    </w:p>
+    <w:p>
+      <w:pPr>
+        <w:spacing w:line="360" w:lineRule="auto" w:after="120"/>
+      </w:pPr>
+      <w:r>
+        <w:rPr>
+          <w:rFonts w:ascii="Times New Roman" w:hAnsi="Times New Roman" w:cs="Times New Roman"/>
+          <w:sz w:val="24"/>
+          <w:szCs w:val="24"/>
+        </w:rPr>
+        <w:t xml:space="preserve"/>
+      </w:r>
+    </w:p>
+    <w:p>
+      <w:pPr>
+        <w:ind w:firstLine="709"/>
+        <w:spacing w:line="360" w:lineRule="auto" w:after="120"/>
+      </w:pPr>
+      <w:r>
+        <w:rPr>
+          <w:rFonts w:ascii="Times New Roman" w:hAnsi="Times New Roman" w:cs="Times New Roman"/>
+          <w:sz w:val="24"/>
+          <w:szCs w:val="24"/>
+        </w:rPr>
         <w:t xml:space="preserve">Для фінальної версії документа потрібно вставити screenshots з папки docs/screenshots.</w:t>
       </w:r>
     </w:p>
@@ -11541,6 +11610,46 @@
           </w:p>
         </w:tc>
       </w:tr>
+      <w:tr>
+        <w:tc>
+          <w:tcPr>
+            <w:tcW w:w="2400" w:type="dxa"/>
+          </w:tcPr>
+          <w:p>
+            <w:pPr>
+              <w:ind w:firstLine="709"/>
+              <w:spacing w:line="360" w:lineRule="auto" w:after="120"/>
+            </w:pPr>
+            <w:r>
+              <w:rPr>
+                <w:rFonts w:ascii="Times New Roman" w:hAnsi="Times New Roman" w:cs="Times New Roman"/>
+                <w:sz w:val="24"/>
+                <w:szCs w:val="24"/>
+              </w:rPr>
+              <w:t xml:space="preserve">Full SQL Server warehouse складно дешево розгорнути у cloud</w:t>
+            </w:r>
+          </w:p>
+        </w:tc>
+        <w:tc>
+          <w:tcPr>
+            <w:tcW w:w="2400" w:type="dxa"/>
+          </w:tcPr>
+          <w:p>
+            <w:pPr>
+              <w:ind w:firstLine="709"/>
+              <w:spacing w:line="360" w:lineRule="auto" w:after="120"/>
+            </w:pPr>
+            <w:r>
+              <w:rPr>
+                <w:rFonts w:ascii="Times New Roman" w:hAnsi="Times New Roman" w:cs="Times New Roman"/>
+                <w:sz w:val="24"/>
+                <w:szCs w:val="24"/>
+              </w:rPr>
+              <w:t xml:space="preserve">Для portfolio demo створено compact PostgreSQL seed runtime</w:t>
+            </w:r>
+          </w:p>
+        </w:tc>
+      </w:tr>
     </w:tbl>
     <w:p>
       <w:pPr>
@@ -11621,7 +11730,7 @@
           <w:sz w:val="24"/>
           <w:szCs w:val="24"/>
         </w:rPr>
-        <w:t xml:space="preserve">• додати PostgreSQL або cloud-friendly deployment mode;</w:t>
+        <w:t xml:space="preserve">• додати monitoring, scheduled backups і managed database для довгострокового deployment;</w:t>
       </w:r>
     </w:p>
     <w:p>
@@ -11663,7 +11772,7 @@
           <w:sz w:val="24"/>
           <w:szCs w:val="24"/>
         </w:rPr>
-        <w:t xml:space="preserve">• створити фінальну presentation-ready deployment package.</w:t>
+        <w:t xml:space="preserve">• створити automated report export для WFM manager.</w:t>
       </w:r>
     </w:p>
     <w:p>
@@ -11718,7 +11827,7 @@
           <w:sz w:val="24"/>
           <w:szCs w:val="24"/>
         </w:rPr>
-        <w:t xml:space="preserve">У четвертому розділі представлено результати реалізації. Проєкт досягнув стану working product: дані завантажені, warehouse побудований, dashboard працює, forecasting model обрана на основі метрик, staffing розраховано, schedule сформовано. Основним незакритим етапом залишається фінальне оформлення пояснювальної записки та презентації.</w:t>
+        <w:t xml:space="preserve">У четвертому розділі представлено результати реалізації. Проєкт досягнув стану working product: дані завантажені, warehouse побудований, dashboard працює, forecasting model обрана на основі метрик, staffing розраховано, schedule сформовано, а portfolio deployment доступний зовні через VPS. Основним незакритим етапом залишається фінальне ручне оформлення пояснювальної записки та презентації.</w:t>
       </w:r>
     </w:p>
     <w:p>
@@ -11773,7 +11882,7 @@
           <w:sz w:val="24"/>
           <w:szCs w:val="24"/>
         </w:rPr>
-        <w:t xml:space="preserve">У межах магістерського інженерного проєкту створено end-to-end систему для call center analytics and workforce optimization. Проєкт пройшов шлях від вибору dataset до локального data product, який підтримує historical reporting, forecasting, staffing calculation і schedule generation.</w:t>
+        <w:t xml:space="preserve">У межах магістерського інженерного проєкту створено end-to-end систему для call center analytics and workforce optimization. Проєкт пройшов шлях від вибору dataset до data product, який підтримує historical reporting, forecasting, staffing calculation, schedule generation і public portfolio demonstration.</w:t>
       </w:r>
     </w:p>
     <w:p>
@@ -11981,6 +12090,34 @@
           <w:sz w:val="24"/>
           <w:szCs w:val="24"/>
         </w:rPr>
+        <w:t xml:space="preserve">• створено compact PostgreSQL deployment mode;</w:t>
+      </w:r>
+    </w:p>
+    <w:p>
+      <w:pPr>
+        <w:ind w:left="720" w:hanging="360"/>
+        <w:spacing w:line="360" w:lineRule="auto" w:after="120"/>
+      </w:pPr>
+      <w:r>
+        <w:rPr>
+          <w:rFonts w:ascii="Times New Roman" w:hAnsi="Times New Roman" w:cs="Times New Roman"/>
+          <w:sz w:val="24"/>
+          <w:szCs w:val="24"/>
+        </w:rPr>
+        <w:t xml:space="preserve">• розгорнуто public dashboard через Docker Compose і Caddy HTTPS;</w:t>
+      </w:r>
+    </w:p>
+    <w:p>
+      <w:pPr>
+        <w:ind w:left="720" w:hanging="360"/>
+        <w:spacing w:line="360" w:lineRule="auto" w:after="120"/>
+      </w:pPr>
+      <w:r>
+        <w:rPr>
+          <w:rFonts w:ascii="Times New Roman" w:hAnsi="Times New Roman" w:cs="Times New Roman"/>
+          <w:sz w:val="24"/>
+          <w:szCs w:val="24"/>
+        </w:rPr>
         <w:t xml:space="preserve">• підготовлено screenshots, demo script, methodology documents і submission checklist.</w:t>
       </w:r>
     </w:p>
@@ -12008,7 +12145,7 @@
           <w:sz w:val="24"/>
           <w:szCs w:val="24"/>
         </w:rPr>
-        <w:t xml:space="preserve">Цілі проєкту досягнуто на рівні working MVP / local analytical product. Система демонструє повний predictive-to-prescriptive workflow: від історичного попиту до майбутнього плану покриття. Окремо важливо, що результат не приховує operational gap: approved 160-agent pool є юридично планованим, але не достатнім для повного покриття 24/7 required staffing curve. Це робить dashboard корисним не лише як демонстраційний інструмент, а і як planning decision support system.</w:t>
+        <w:t xml:space="preserve">Цілі проєкту досягнуто на рівні working MVP / portfolio analytical product. Система демонструє повний predictive-to-prescriptive workflow: від історичного попиту до майбутнього плану покриття. Окремо важливо, що результат не приховує operational gap: approved 160-agent pool є юридично планованим, але не достатнім для повного покриття 24/7 required staffing curve. Це робить dashboard корисним не лише як демонстраційний інструмент, а і як planning decision support system.</w:t>
       </w:r>
     </w:p>
     <w:p>
@@ -12118,7 +12255,21 @@
           <w:sz w:val="24"/>
           <w:szCs w:val="24"/>
         </w:rPr>
-        <w:t xml:space="preserve">• dashboard працює як local product, а не production cloud deployment.</w:t>
+        <w:t xml:space="preserve">• public deployment використовує compact seed tables, а не повний SQL Server warehouse;</w:t>
+      </w:r>
+    </w:p>
+    <w:p>
+      <w:pPr>
+        <w:ind w:left="720" w:hanging="360"/>
+        <w:spacing w:line="360" w:lineRule="auto" w:after="120"/>
+      </w:pPr>
+      <w:r>
+        <w:rPr>
+          <w:rFonts w:ascii="Times New Roman" w:hAnsi="Times New Roman" w:cs="Times New Roman"/>
+          <w:sz w:val="24"/>
+          <w:szCs w:val="24"/>
+        </w:rPr>
+        <w:t xml:space="preserve">• dashboard має portfolio-grade hardening, але не є production SaaS із SLA, monitoring і backup policy.</w:t>
       </w:r>
     </w:p>
     <w:p>
@@ -12228,7 +12379,21 @@
           <w:sz w:val="24"/>
           <w:szCs w:val="24"/>
         </w:rPr>
-        <w:t xml:space="preserve">• розглядати MLflow або інший experiment tracking layer як optional future improvement після завершення основного submission package.</w:t>
+        <w:t xml:space="preserve">• розглядати MLflow або інший experiment tracking layer як optional future improvement після завершення основного submission package;</w:t>
+      </w:r>
+    </w:p>
+    <w:p>
+      <w:pPr>
+        <w:ind w:left="720" w:hanging="360"/>
+        <w:spacing w:line="360" w:lineRule="auto" w:after="120"/>
+      </w:pPr>
+      <w:r>
+        <w:rPr>
+          <w:rFonts w:ascii="Times New Roman" w:hAnsi="Times New Roman" w:cs="Times New Roman"/>
+          <w:sz w:val="24"/>
+          <w:szCs w:val="24"/>
+        </w:rPr>
+        <w:t xml:space="preserve">• перед широким поширенням portfolio link змінити demo password і визначити, чи потрібен uptime monitoring.</w:t>
       </w:r>
     </w:p>
     <w:p>

</xml_diff>